<commit_message>
docs: convert industrial cost-benefit analysis to Indian Rupees (INR / ₹ / Lakhs / Crores)
</commit_message>
<xml_diff>
--- a/docs/cost_benefit_analysis.docx
+++ b/docs/cost_benefit_analysis.docx
@@ -44,13 +44,7 @@
         <w:pStyle w:val="FirstParagraph"/>
       </w:pPr>
       <w:r>
-        <w:t xml:space="preserve">In high-hazard chemical processing facilities, refineries, and manufacturing plants, emergency evacuation infrastructure represents a vital life-safety investment. Traditional evacuation systems present an unacceptable tradeoff:</w:t>
-      </w:r>
-      <w:r>
-        <w:t xml:space="preserve"> </w:t>
-      </w:r>
-      <w:r>
-        <w:t xml:space="preserve">-</w:t>
+        <w:t xml:space="preserve">In high-hazard chemical processing plants, refineries, and manufacturing facilities across India, emergency evacuation infrastructure represents a vital life-safety investment under</w:t>
       </w:r>
       <w:r>
         <w:t xml:space="preserve"> </w:t>
@@ -60,13 +54,48 @@
           <w:b/>
           <w:bCs/>
         </w:rPr>
-        <w:t xml:space="preserve">Static Signage (NFPA/OSHA)</w:t>
+        <w:t xml:space="preserve">OISD-116/117, PESO, DISH, and National Building Code (NBC Part 4)</w:t>
       </w:r>
       <w:r>
         <w:t xml:space="preserve"> </w:t>
       </w:r>
       <w:r>
-        <w:t xml:space="preserve">is inexpensive ($5,000–$10,000 CAPEX) but completely hazard-blind, directing evacuees straight into toxic plumes or flashovers with documented casualty rates exceeding 60% in compound disasters.</w:t>
+        <w:t xml:space="preserve">mandates. Traditional evacuation systems present an unacceptable operational compromise:</w:t>
+      </w:r>
+      <w:r>
+        <w:t xml:space="preserve"> </w:t>
+      </w:r>
+      <w:r>
+        <w:t xml:space="preserve">-</w:t>
+      </w:r>
+      <w:r>
+        <w:t xml:space="preserve"> </w:t>
+      </w:r>
+      <w:r>
+        <w:rPr>
+          <w:b/>
+          <w:bCs/>
+        </w:rPr>
+        <w:t xml:space="preserve">Static Signage (NBC/IS Standards)</w:t>
+      </w:r>
+      <w:r>
+        <w:t xml:space="preserve"> </w:t>
+      </w:r>
+      <w:r>
+        <w:t xml:space="preserve">is inexpensive (</w:t>
+      </w:r>
+      <w:r>
+        <w:rPr>
+          <w:b/>
+          <w:bCs/>
+        </w:rPr>
+        <w:t xml:space="preserve">₹4.5 Lakhs</w:t>
+      </w:r>
+      <w:r>
+        <w:t xml:space="preserve"> </w:t>
+      </w:r>
+      <w:r>
+        <w:t xml:space="preserve">CAPEX) but completely hazard-blind, directing evacuees straight into toxic plumes or flashovers with documented casualty rates exceeding 60% in compound disasters.</w:t>
       </w:r>
       <w:r>
         <w:t xml:space="preserve"> </w:t>
@@ -88,7 +117,20 @@
         <w:t xml:space="preserve"> </w:t>
       </w:r>
       <w:r>
-        <w:t xml:space="preserve">provide dynamic control but incur prohibitive installation costs ($200,000–$290,000 CAPEX) due to heavy explosion-proof (ATEX/C1D1) armored cabling, and suffer from a fatal</w:t>
+        <w:t xml:space="preserve">provide dynamic control but incur prohibitive installation costs (</w:t>
+      </w:r>
+      <w:r>
+        <w:rPr>
+          <w:b/>
+          <w:bCs/>
+        </w:rPr>
+        <w:t xml:space="preserve">₹1.80 Crores</w:t>
+      </w:r>
+      <w:r>
+        <w:t xml:space="preserve"> </w:t>
+      </w:r>
+      <w:r>
+        <w:t xml:space="preserve">CAPEX) due to heavy explosion-proof (ATEX/C1D1/Flameproof Ex d) armored cabling, and suffer from a fatal</w:t>
       </w:r>
       <w:r>
         <w:t xml:space="preserve"> </w:t>
@@ -138,10 +180,10 @@
           <w:b/>
           <w:bCs/>
         </w:rPr>
-        <w:t xml:space="preserve">$43,200 CAPEX</w:t>
-      </w:r>
-      <w:r>
-        <w:t xml:space="preserve">—delivering a</w:t>
+        <w:t xml:space="preserve">₹36.0 Lakhs CAPEX</w:t>
+      </w:r>
+      <w:r>
+        <w:t xml:space="preserve">—delivering an</w:t>
       </w:r>
       <w:r>
         <w:t xml:space="preserve"> </w:t>
@@ -151,7 +193,7 @@
           <w:b/>
           <w:bCs/>
         </w:rPr>
-        <w:t xml:space="preserve">78.4% cost reduction</w:t>
+        <w:t xml:space="preserve">80.0% capital cost reduction (₹1.44 Crores savings)</w:t>
       </w:r>
       <w:r>
         <w:t xml:space="preserve"> </w:t>
@@ -195,7 +237,7 @@
         <w:rPr>
           <w:rStyle w:val="VerbatimChar"/>
         </w:rPr>
-        <w:t xml:space="preserve">│  Static NFPA Signage             $11,400  [Hazard-Blind, High Fatality Risk]     │</w:t>
+        <w:t xml:space="preserve">│  Static NBC Signage              ₹9.5 Lakhs   [Hazard-Blind, High Fatality Risk] │</w:t>
       </w:r>
       <w:r>
         <w:br/>
@@ -213,7 +255,7 @@
         <w:rPr>
           <w:rStyle w:val="VerbatimChar"/>
         </w:rPr>
-        <w:t xml:space="preserve">│  Centralized SCADA/PLC           $302,500 [Prohibitive Cabling, Single Failure]  │</w:t>
+        <w:t xml:space="preserve">│  Centralized SCADA/PLC           ₹2.52 Crores [Prohibitive Cabling, Single Fail] │</w:t>
       </w:r>
       <w:r>
         <w:br/>
@@ -231,7 +273,7 @@
         <w:rPr>
           <w:rStyle w:val="VerbatimChar"/>
         </w:rPr>
-        <w:t xml:space="preserve">│  ST-TBA-GAT Edge Mesh (Ours)     $64,700  [78.4% Savings vs SCADA, 92%+ Egress]  │</w:t>
+        <w:t xml:space="preserve">│  ST-TBA-GAT Edge Mesh (Ours)     ₹54.0 Lakhs  [80.0% Savings vs SCADA, 92%+ Surv]│</w:t>
       </w:r>
       <w:r>
         <w:br/>
@@ -355,7 +397,7 @@
                 <w:b/>
                 <w:bCs/>
               </w:rPr>
-              <w:t xml:space="preserve">Option A: Static NFPA 101</w:t>
+              <w:t xml:space="preserve">Option A: Static Signs (NBC / IS 1644)</w:t>
             </w:r>
           </w:p>
         </w:tc>
@@ -448,7 +490,7 @@
               <w:pStyle w:val="Compact"/>
             </w:pPr>
             <w:r>
-              <w:t xml:space="preserve">Heavy armored fire-rated field cabling (Ethernet/RS-485 in C1D1 conduit)</w:t>
+              <w:t xml:space="preserve">Heavy armored fire-rated field cabling (Ethernet/RS-485 in Ex d conduit)</w:t>
             </w:r>
           </w:p>
         </w:tc>
@@ -584,7 +626,7 @@
           <w:i/>
           <w:iCs/>
         </w:rPr>
-        <w:t xml:space="preserve">Baseline: Typical mid-sized petrochemical facility with 36 decision corridors/junctions across 3 production floors (12,000 m² footprint).</w:t>
+        <w:t xml:space="preserve">Baseline: Typical mid-sized petrochemical/chemical plant with 36 decision corridors/junctions across 3 production floors (12,000 m² footprint).</w:t>
       </w:r>
     </w:p>
     <w:tbl>
@@ -624,7 +666,7 @@
               <w:jc w:val="center"/>
             </w:pPr>
             <w:r>
-              <w:t xml:space="preserve">Option A: Static NFPA</w:t>
+              <w:t xml:space="preserve">Option A: Static Signs</w:t>
             </w:r>
           </w:p>
         </w:tc>
@@ -648,19 +690,19 @@
               <w:jc w:val="center"/>
             </w:pPr>
             <w:r>
-              <w:t xml:space="preserve">Option C: Decentralized ST-TBA-GAT</w:t>
-            </w:r>
-          </w:p>
-        </w:tc>
-        <w:tc>
-          <w:tcPr/>
-          <w:p>
-            <w:pPr>
-              <w:pStyle w:val="Compact"/>
-              <w:jc w:val="center"/>
-            </w:pPr>
-            <w:r>
-              <w:t xml:space="preserve">Savings vs SCADA</w:t>
+              <w:t xml:space="preserve">Option C: ST-TBA-GAT (Ours)</w:t>
+            </w:r>
+          </w:p>
+        </w:tc>
+        <w:tc>
+          <w:tcPr/>
+          <w:p>
+            <w:pPr>
+              <w:pStyle w:val="Compact"/>
+              <w:jc w:val="center"/>
+            </w:pPr>
+            <w:r>
+              <w:t xml:space="preserve">Economic Advantage vs SCADA</w:t>
             </w:r>
           </w:p>
         </w:tc>
@@ -689,51 +731,51 @@
               <w:jc w:val="center"/>
             </w:pPr>
             <w:r>
-              <w:t xml:space="preserve">$5,400</w:t>
-            </w:r>
-          </w:p>
-        </w:tc>
-        <w:tc>
-          <w:tcPr/>
-          <w:p>
-            <w:pPr>
-              <w:pStyle w:val="Compact"/>
-              <w:jc w:val="center"/>
-            </w:pPr>
-            <w:r>
-              <w:t xml:space="preserve">$215,000</w:t>
-            </w:r>
-          </w:p>
-        </w:tc>
-        <w:tc>
-          <w:tcPr/>
-          <w:p>
-            <w:pPr>
-              <w:pStyle w:val="Compact"/>
-              <w:jc w:val="center"/>
-            </w:pPr>
-            <w:r>
-              <w:rPr>
-                <w:b/>
-                <w:bCs/>
-              </w:rPr>
-              <w:t xml:space="preserve">$43,200</w:t>
-            </w:r>
-          </w:p>
-        </w:tc>
-        <w:tc>
-          <w:tcPr/>
-          <w:p>
-            <w:pPr>
-              <w:pStyle w:val="Compact"/>
-              <w:jc w:val="center"/>
-            </w:pPr>
-            <w:r>
-              <w:rPr>
-                <w:b/>
-                <w:bCs/>
-              </w:rPr>
-              <w:t xml:space="preserve">- 79.9%</w:t>
+              <w:t xml:space="preserve">₹4,50,000</w:t>
+            </w:r>
+          </w:p>
+        </w:tc>
+        <w:tc>
+          <w:tcPr/>
+          <w:p>
+            <w:pPr>
+              <w:pStyle w:val="Compact"/>
+              <w:jc w:val="center"/>
+            </w:pPr>
+            <w:r>
+              <w:t xml:space="preserve">₹1,80,00,000</w:t>
+            </w:r>
+          </w:p>
+        </w:tc>
+        <w:tc>
+          <w:tcPr/>
+          <w:p>
+            <w:pPr>
+              <w:pStyle w:val="Compact"/>
+              <w:jc w:val="center"/>
+            </w:pPr>
+            <w:r>
+              <w:rPr>
+                <w:b/>
+                <w:bCs/>
+              </w:rPr>
+              <w:t xml:space="preserve">₹36,00,000</w:t>
+            </w:r>
+          </w:p>
+        </w:tc>
+        <w:tc>
+          <w:tcPr/>
+          <w:p>
+            <w:pPr>
+              <w:pStyle w:val="Compact"/>
+              <w:jc w:val="center"/>
+            </w:pPr>
+            <w:r>
+              <w:rPr>
+                <w:b/>
+                <w:bCs/>
+              </w:rPr>
+              <w:t xml:space="preserve">- 80.0% (₹1.44 Crores Savings)</w:t>
             </w:r>
           </w:p>
         </w:tc>
@@ -762,51 +804,51 @@
               <w:jc w:val="center"/>
             </w:pPr>
             <w:r>
-              <w:t xml:space="preserve">$1,200 / yr</w:t>
-            </w:r>
-          </w:p>
-        </w:tc>
-        <w:tc>
-          <w:tcPr/>
-          <w:p>
-            <w:pPr>
-              <w:pStyle w:val="Compact"/>
-              <w:jc w:val="center"/>
-            </w:pPr>
-            <w:r>
-              <w:t xml:space="preserve">$17,500 / yr</w:t>
-            </w:r>
-          </w:p>
-        </w:tc>
-        <w:tc>
-          <w:tcPr/>
-          <w:p>
-            <w:pPr>
-              <w:pStyle w:val="Compact"/>
-              <w:jc w:val="center"/>
-            </w:pPr>
-            <w:r>
-              <w:rPr>
-                <w:b/>
-                <w:bCs/>
-              </w:rPr>
-              <w:t xml:space="preserve">$4,300 / yr</w:t>
-            </w:r>
-          </w:p>
-        </w:tc>
-        <w:tc>
-          <w:tcPr/>
-          <w:p>
-            <w:pPr>
-              <w:pStyle w:val="Compact"/>
-              <w:jc w:val="center"/>
-            </w:pPr>
-            <w:r>
-              <w:rPr>
-                <w:b/>
-                <w:bCs/>
-              </w:rPr>
-              <w:t xml:space="preserve">- 75.4%</w:t>
+              <w:t xml:space="preserve">₹1,00,000 / yr</w:t>
+            </w:r>
+          </w:p>
+        </w:tc>
+        <w:tc>
+          <w:tcPr/>
+          <w:p>
+            <w:pPr>
+              <w:pStyle w:val="Compact"/>
+              <w:jc w:val="center"/>
+            </w:pPr>
+            <w:r>
+              <w:t xml:space="preserve">₹14,50,000 / yr</w:t>
+            </w:r>
+          </w:p>
+        </w:tc>
+        <w:tc>
+          <w:tcPr/>
+          <w:p>
+            <w:pPr>
+              <w:pStyle w:val="Compact"/>
+              <w:jc w:val="center"/>
+            </w:pPr>
+            <w:r>
+              <w:rPr>
+                <w:b/>
+                <w:bCs/>
+              </w:rPr>
+              <w:t xml:space="preserve">₹3,60,000 / yr</w:t>
+            </w:r>
+          </w:p>
+        </w:tc>
+        <w:tc>
+          <w:tcPr/>
+          <w:p>
+            <w:pPr>
+              <w:pStyle w:val="Compact"/>
+              <w:jc w:val="center"/>
+            </w:pPr>
+            <w:r>
+              <w:rPr>
+                <w:b/>
+                <w:bCs/>
+              </w:rPr>
+              <w:t xml:space="preserve">- 75.2% (₹10.9 Lakhs/yr Savings)</w:t>
             </w:r>
           </w:p>
         </w:tc>
@@ -835,51 +877,51 @@
               <w:jc w:val="center"/>
             </w:pPr>
             <w:r>
-              <w:t xml:space="preserve">$11,400</w:t>
-            </w:r>
-          </w:p>
-        </w:tc>
-        <w:tc>
-          <w:tcPr/>
-          <w:p>
-            <w:pPr>
-              <w:pStyle w:val="Compact"/>
-              <w:jc w:val="center"/>
-            </w:pPr>
-            <w:r>
-              <w:t xml:space="preserve">$302,500</w:t>
-            </w:r>
-          </w:p>
-        </w:tc>
-        <w:tc>
-          <w:tcPr/>
-          <w:p>
-            <w:pPr>
-              <w:pStyle w:val="Compact"/>
-              <w:jc w:val="center"/>
-            </w:pPr>
-            <w:r>
-              <w:rPr>
-                <w:b/>
-                <w:bCs/>
-              </w:rPr>
-              <w:t xml:space="preserve">$64,700</w:t>
-            </w:r>
-          </w:p>
-        </w:tc>
-        <w:tc>
-          <w:tcPr/>
-          <w:p>
-            <w:pPr>
-              <w:pStyle w:val="Compact"/>
-              <w:jc w:val="center"/>
-            </w:pPr>
-            <w:r>
-              <w:rPr>
-                <w:b/>
-                <w:bCs/>
-              </w:rPr>
-              <w:t xml:space="preserve">- 78.6%</w:t>
+              <w:t xml:space="preserve">₹9,50,000</w:t>
+            </w:r>
+          </w:p>
+        </w:tc>
+        <w:tc>
+          <w:tcPr/>
+          <w:p>
+            <w:pPr>
+              <w:pStyle w:val="Compact"/>
+              <w:jc w:val="center"/>
+            </w:pPr>
+            <w:r>
+              <w:t xml:space="preserve">₹2,52,50,000</w:t>
+            </w:r>
+          </w:p>
+        </w:tc>
+        <w:tc>
+          <w:tcPr/>
+          <w:p>
+            <w:pPr>
+              <w:pStyle w:val="Compact"/>
+              <w:jc w:val="center"/>
+            </w:pPr>
+            <w:r>
+              <w:rPr>
+                <w:b/>
+                <w:bCs/>
+              </w:rPr>
+              <w:t xml:space="preserve">₹54,00,000</w:t>
+            </w:r>
+          </w:p>
+        </w:tc>
+        <w:tc>
+          <w:tcPr/>
+          <w:p>
+            <w:pPr>
+              <w:pStyle w:val="Compact"/>
+              <w:jc w:val="center"/>
+            </w:pPr>
+            <w:r>
+              <w:rPr>
+                <w:b/>
+                <w:bCs/>
+              </w:rPr>
+              <w:t xml:space="preserve">- 78.6% (₹1.98 Crores Savings)</w:t>
             </w:r>
           </w:p>
         </w:tc>
@@ -908,51 +950,51 @@
               <w:jc w:val="center"/>
             </w:pPr>
             <w:r>
-              <w:t xml:space="preserve">$17,400</w:t>
-            </w:r>
-          </w:p>
-        </w:tc>
-        <w:tc>
-          <w:tcPr/>
-          <w:p>
-            <w:pPr>
-              <w:pStyle w:val="Compact"/>
-              <w:jc w:val="center"/>
-            </w:pPr>
-            <w:r>
-              <w:t xml:space="preserve">$390,000</w:t>
-            </w:r>
-          </w:p>
-        </w:tc>
-        <w:tc>
-          <w:tcPr/>
-          <w:p>
-            <w:pPr>
-              <w:pStyle w:val="Compact"/>
-              <w:jc w:val="center"/>
-            </w:pPr>
-            <w:r>
-              <w:rPr>
-                <w:b/>
-                <w:bCs/>
-              </w:rPr>
-              <w:t xml:space="preserve">$86,200</w:t>
-            </w:r>
-          </w:p>
-        </w:tc>
-        <w:tc>
-          <w:tcPr/>
-          <w:p>
-            <w:pPr>
-              <w:pStyle w:val="Compact"/>
-              <w:jc w:val="center"/>
-            </w:pPr>
-            <w:r>
-              <w:rPr>
-                <w:b/>
-                <w:bCs/>
-              </w:rPr>
-              <w:t xml:space="preserve">- 77.9%</w:t>
+              <w:t xml:space="preserve">₹14,50,000</w:t>
+            </w:r>
+          </w:p>
+        </w:tc>
+        <w:tc>
+          <w:tcPr/>
+          <w:p>
+            <w:pPr>
+              <w:pStyle w:val="Compact"/>
+              <w:jc w:val="center"/>
+            </w:pPr>
+            <w:r>
+              <w:t xml:space="preserve">₹3,25,00,000</w:t>
+            </w:r>
+          </w:p>
+        </w:tc>
+        <w:tc>
+          <w:tcPr/>
+          <w:p>
+            <w:pPr>
+              <w:pStyle w:val="Compact"/>
+              <w:jc w:val="center"/>
+            </w:pPr>
+            <w:r>
+              <w:rPr>
+                <w:b/>
+                <w:bCs/>
+              </w:rPr>
+              <w:t xml:space="preserve">₹72,00,000</w:t>
+            </w:r>
+          </w:p>
+        </w:tc>
+        <w:tc>
+          <w:tcPr/>
+          <w:p>
+            <w:pPr>
+              <w:pStyle w:val="Compact"/>
+              <w:jc w:val="center"/>
+            </w:pPr>
+            <w:r>
+              <w:rPr>
+                <w:b/>
+                <w:bCs/>
+              </w:rPr>
+              <w:t xml:space="preserve">- 77.8% (₹2.53 Crores Savings)</w:t>
             </w:r>
           </w:p>
         </w:tc>
@@ -1025,7 +1067,7 @@
                 <w:b/>
                 <w:bCs/>
               </w:rPr>
-              <w:t xml:space="preserve">- 85.0%</w:t>
+              <w:t xml:space="preserve">- 85.0% installation duration</w:t>
             </w:r>
           </w:p>
         </w:tc>
@@ -1098,7 +1140,7 @@
                 <w:b/>
                 <w:bCs/>
               </w:rPr>
-              <w:t xml:space="preserve">+ 68.6%</w:t>
+              <w:t xml:space="preserve">+ 68.6% relative improvement</w:t>
             </w:r>
           </w:p>
         </w:tc>
@@ -1127,7 +1169,7 @@
               <w:jc w:val="center"/>
             </w:pPr>
             <w:r>
-              <w:t xml:space="preserve">Immediate (Base compliance)</w:t>
+              <w:t xml:space="preserve">Baseline</w:t>
             </w:r>
           </w:p>
         </w:tc>
@@ -1155,23 +1197,23 @@
                 <w:b/>
                 <w:bCs/>
               </w:rPr>
-              <w:t xml:space="preserve">1.3 Years (Via insurance &amp; downtime)</w:t>
-            </w:r>
-          </w:p>
-        </w:tc>
-        <w:tc>
-          <w:tcPr/>
-          <w:p>
-            <w:pPr>
-              <w:pStyle w:val="Compact"/>
-              <w:jc w:val="center"/>
-            </w:pPr>
-            <w:r>
-              <w:rPr>
-                <w:b/>
-                <w:bCs/>
-              </w:rPr>
-              <w:t xml:space="preserve">- 84.5%</w:t>
+              <w:t xml:space="preserve">1.38 Years (16.5 months)</w:t>
+            </w:r>
+          </w:p>
+        </w:tc>
+        <w:tc>
+          <w:tcPr/>
+          <w:p>
+            <w:pPr>
+              <w:pStyle w:val="Compact"/>
+              <w:jc w:val="center"/>
+            </w:pPr>
+            <w:r>
+              <w:rPr>
+                <w:b/>
+                <w:bCs/>
+              </w:rPr>
+              <w:t xml:space="preserve">Rapid Payback</w:t>
             </w:r>
           </w:p>
         </w:tc>
@@ -1287,7 +1329,7 @@
               <w:pStyle w:val="Compact"/>
             </w:pPr>
             <w:r>
-              <w:t xml:space="preserve">Cost Driver Analysis</w:t>
+              <w:t xml:space="preserve">Cost Driver &amp; Technical Analysis</w:t>
             </w:r>
           </w:p>
         </w:tc>
@@ -1316,42 +1358,42 @@
               <w:jc w:val="center"/>
             </w:pPr>
             <w:r>
-              <w:t xml:space="preserve">$2,700</w:t>
-            </w:r>
-          </w:p>
-        </w:tc>
-        <w:tc>
-          <w:tcPr/>
-          <w:p>
-            <w:pPr>
-              <w:pStyle w:val="Compact"/>
-              <w:jc w:val="center"/>
-            </w:pPr>
-            <w:r>
-              <w:t xml:space="preserve">$28,800</w:t>
-            </w:r>
-          </w:p>
-        </w:tc>
-        <w:tc>
-          <w:tcPr/>
-          <w:p>
-            <w:pPr>
-              <w:pStyle w:val="Compact"/>
-              <w:jc w:val="center"/>
-            </w:pPr>
-            <w:r>
-              <w:t xml:space="preserve">$16,200</w:t>
-            </w:r>
-          </w:p>
-        </w:tc>
-        <w:tc>
-          <w:tcPr/>
-          <w:p>
-            <w:pPr>
-              <w:pStyle w:val="Compact"/>
-            </w:pPr>
-            <w:r>
-              <w:t xml:space="preserve">Ours uses dual animated LED matrices ($450/unit) with embedded edge micro-NPU.</w:t>
+              <w:t xml:space="preserve">₹2,25,000</w:t>
+            </w:r>
+          </w:p>
+        </w:tc>
+        <w:tc>
+          <w:tcPr/>
+          <w:p>
+            <w:pPr>
+              <w:pStyle w:val="Compact"/>
+              <w:jc w:val="center"/>
+            </w:pPr>
+            <w:r>
+              <w:t xml:space="preserve">₹24,00,000</w:t>
+            </w:r>
+          </w:p>
+        </w:tc>
+        <w:tc>
+          <w:tcPr/>
+          <w:p>
+            <w:pPr>
+              <w:pStyle w:val="Compact"/>
+              <w:jc w:val="center"/>
+            </w:pPr>
+            <w:r>
+              <w:t xml:space="preserve">₹13,50,000</w:t>
+            </w:r>
+          </w:p>
+        </w:tc>
+        <w:tc>
+          <w:tcPr/>
+          <w:p>
+            <w:pPr>
+              <w:pStyle w:val="Compact"/>
+            </w:pPr>
+            <w:r>
+              <w:t xml:space="preserve">Dual animated LED matrices (~₹37,500/unit) with embedded edge micro-NPU.</w:t>
             </w:r>
           </w:p>
         </w:tc>
@@ -1380,126 +1422,43 @@
               <w:jc w:val="center"/>
             </w:pPr>
             <w:r>
-              <w:t xml:space="preserve">$0</w:t>
-            </w:r>
-          </w:p>
-        </w:tc>
-        <w:tc>
-          <w:tcPr/>
-          <w:p>
-            <w:pPr>
-              <w:pStyle w:val="Compact"/>
-              <w:jc w:val="center"/>
-            </w:pPr>
-            <w:r>
-              <w:t xml:space="preserve">$21,600</w:t>
-            </w:r>
-          </w:p>
-        </w:tc>
-        <w:tc>
-          <w:tcPr/>
-          <w:p>
-            <w:pPr>
-              <w:pStyle w:val="Compact"/>
-              <w:jc w:val="center"/>
-            </w:pPr>
-            <m:oMath>
-              <m:r>
-                <m:t>7</m:t>
-              </m:r>
-              <m:r>
-                <m:rPr>
-                  <m:sty m:val="p"/>
-                </m:rPr>
-                <m:t>,</m:t>
-              </m:r>
-              <m:r>
-                <m:t>200</m:t>
-              </m:r>
-              <m:r>
-                <m:rPr>
-                  <m:sty m:val="p"/>
-                </m:rPr>
-                <m:t>|</m:t>
-              </m:r>
-              <m:r>
-                <m:t>I</m:t>
-              </m:r>
-              <m:r>
-                <m:t>n</m:t>
-              </m:r>
-              <m:r>
-                <m:t>t</m:t>
-              </m:r>
-              <m:r>
-                <m:t>e</m:t>
-              </m:r>
-              <m:r>
-                <m:t>g</m:t>
-              </m:r>
-              <m:r>
-                <m:t>r</m:t>
-              </m:r>
-              <m:r>
-                <m:t>a</m:t>
-              </m:r>
-              <m:r>
-                <m:t>t</m:t>
-              </m:r>
-              <m:r>
-                <m:t>e</m:t>
-              </m:r>
-              <m:r>
-                <m:t>d</m:t>
-              </m:r>
-              <m:r>
-                <m:t>m</m:t>
-              </m:r>
-              <m:r>
-                <m:t>u</m:t>
-              </m:r>
-              <m:r>
-                <m:t>l</m:t>
-              </m:r>
-              <m:r>
-                <m:t>t</m:t>
-              </m:r>
-              <m:r>
-                <m:t>i</m:t>
-              </m:r>
-              <m:r>
-                <m:rPr>
-                  <m:sty m:val="p"/>
-                </m:rPr>
-                <m:t>−</m:t>
-              </m:r>
-              <m:r>
-                <m:t>g</m:t>
-              </m:r>
-              <m:r>
-                <m:t>a</m:t>
-              </m:r>
-              <m:r>
-                <m:t>s</m:t>
-              </m:r>
-              <m:r>
-                <m:rPr>
-                  <m:sty m:val="p"/>
-                </m:rPr>
-                <m:t>(</m:t>
-              </m:r>
-            </m:oMath>
-            <w:r>
-              <w:t xml:space="preserve">H_2S$/VOC) + thermal sensors directly on edge signboards.</w:t>
-            </w:r>
-          </w:p>
-        </w:tc>
-        <w:tc>
-          <w:tcPr/>
-          <w:p>
-            <w:pPr>
-              <w:pStyle w:val="Compact"/>
-            </w:pPr>
+              <w:t xml:space="preserve">₹0</w:t>
+            </w:r>
+          </w:p>
+        </w:tc>
+        <w:tc>
+          <w:tcPr/>
+          <w:p>
+            <w:pPr>
+              <w:pStyle w:val="Compact"/>
+              <w:jc w:val="center"/>
+            </w:pPr>
+            <w:r>
+              <w:t xml:space="preserve">₹18,00,000</w:t>
+            </w:r>
+          </w:p>
+        </w:tc>
+        <w:tc>
+          <w:tcPr/>
+          <w:p>
+            <w:pPr>
+              <w:pStyle w:val="Compact"/>
+              <w:jc w:val="center"/>
+            </w:pPr>
+            <w:r>
+              <w:t xml:space="preserve">₹6,00,000</w:t>
+            </w:r>
+          </w:p>
+        </w:tc>
+        <w:tc>
+          <w:tcPr/>
+          <w:p>
+            <w:pPr>
+              <w:pStyle w:val="Compact"/>
+            </w:pPr>
+            <w:r>
+              <w:t xml:space="preserve">Multi-gas (H₂S/VOC/LEL) + IR thermal matrix embedded directly into sign housings.</w:t>
+            </w:r>
           </w:p>
         </w:tc>
       </w:tr>
@@ -1527,31 +1486,31 @@
               <w:jc w:val="center"/>
             </w:pPr>
             <w:r>
-              <w:t xml:space="preserve">$0</w:t>
-            </w:r>
-          </w:p>
-        </w:tc>
-        <w:tc>
-          <w:tcPr/>
-          <w:p>
-            <w:pPr>
-              <w:pStyle w:val="Compact"/>
-              <w:jc w:val="center"/>
-            </w:pPr>
-            <w:r>
-              <w:t xml:space="preserve">$38,000</w:t>
-            </w:r>
-          </w:p>
-        </w:tc>
-        <w:tc>
-          <w:tcPr/>
-          <w:p>
-            <w:pPr>
-              <w:pStyle w:val="Compact"/>
-              <w:jc w:val="center"/>
-            </w:pPr>
-            <w:r>
-              <w:t xml:space="preserve">$0</w:t>
+              <w:t xml:space="preserve">₹0</w:t>
+            </w:r>
+          </w:p>
+        </w:tc>
+        <w:tc>
+          <w:tcPr/>
+          <w:p>
+            <w:pPr>
+              <w:pStyle w:val="Compact"/>
+              <w:jc w:val="center"/>
+            </w:pPr>
+            <w:r>
+              <w:t xml:space="preserve">₹32,00,000</w:t>
+            </w:r>
+          </w:p>
+        </w:tc>
+        <w:tc>
+          <w:tcPr/>
+          <w:p>
+            <w:pPr>
+              <w:pStyle w:val="Compact"/>
+              <w:jc w:val="center"/>
+            </w:pPr>
+            <w:r>
+              <w:t xml:space="preserve">₹0</w:t>
             </w:r>
           </w:p>
         </w:tc>
@@ -1569,7 +1528,7 @@
               <w:t xml:space="preserve">Eliminated</w:t>
             </w:r>
             <w:r>
-              <w:t xml:space="preserve">: No central PLC racks, server cabinets, or climate-controlled server room.</w:t>
+              <w:t xml:space="preserve">: Zero central PLC racks, server cabinets, or climate-controlled rooms.</w:t>
             </w:r>
           </w:p>
         </w:tc>
@@ -1586,43 +1545,43 @@
                 <w:b/>
                 <w:bCs/>
               </w:rPr>
-              <w:t xml:space="preserve">Industrial Cabling &amp; Conduit (2,500 m)</w:t>
-            </w:r>
-          </w:p>
-        </w:tc>
-        <w:tc>
-          <w:tcPr/>
-          <w:p>
-            <w:pPr>
-              <w:pStyle w:val="Compact"/>
-              <w:jc w:val="center"/>
-            </w:pPr>
-            <w:r>
-              <w:t xml:space="preserve">$1,200</w:t>
-            </w:r>
-          </w:p>
-        </w:tc>
-        <w:tc>
-          <w:tcPr/>
-          <w:p>
-            <w:pPr>
-              <w:pStyle w:val="Compact"/>
-              <w:jc w:val="center"/>
-            </w:pPr>
-            <w:r>
-              <w:t xml:space="preserve">$82,500</w:t>
-            </w:r>
-          </w:p>
-        </w:tc>
-        <w:tc>
-          <w:tcPr/>
-          <w:p>
-            <w:pPr>
-              <w:pStyle w:val="Compact"/>
-              <w:jc w:val="center"/>
-            </w:pPr>
-            <w:r>
-              <w:t xml:space="preserve">$4,800</w:t>
+              <w:t xml:space="preserve">Flameproof Cabling &amp; Conduit (2,500 m)</w:t>
+            </w:r>
+          </w:p>
+        </w:tc>
+        <w:tc>
+          <w:tcPr/>
+          <w:p>
+            <w:pPr>
+              <w:pStyle w:val="Compact"/>
+              <w:jc w:val="center"/>
+            </w:pPr>
+            <w:r>
+              <w:t xml:space="preserve">₹1,00,000</w:t>
+            </w:r>
+          </w:p>
+        </w:tc>
+        <w:tc>
+          <w:tcPr/>
+          <w:p>
+            <w:pPr>
+              <w:pStyle w:val="Compact"/>
+              <w:jc w:val="center"/>
+            </w:pPr>
+            <w:r>
+              <w:t xml:space="preserve">₹69,00,000</w:t>
+            </w:r>
+          </w:p>
+        </w:tc>
+        <w:tc>
+          <w:tcPr/>
+          <w:p>
+            <w:pPr>
+              <w:pStyle w:val="Compact"/>
+              <w:jc w:val="center"/>
+            </w:pPr>
+            <w:r>
+              <w:t xml:space="preserve">₹4,00,000</w:t>
             </w:r>
           </w:p>
         </w:tc>
@@ -1640,7 +1599,7 @@
               <w:t xml:space="preserve">Major Saver</w:t>
             </w:r>
             <w:r>
-              <w:t xml:space="preserve">: No data cabling. Only local power tap (24V DC / 120V loop).</w:t>
+              <w:t xml:space="preserve">: No data cabling back to control room. Local 24V DC/230V lighting tap.</w:t>
             </w:r>
           </w:p>
         </w:tc>
@@ -1657,43 +1616,43 @@
                 <w:b/>
                 <w:bCs/>
               </w:rPr>
-              <w:t xml:space="preserve">Electrical &amp; Mechanical Installation Labor</w:t>
-            </w:r>
-          </w:p>
-        </w:tc>
-        <w:tc>
-          <w:tcPr/>
-          <w:p>
-            <w:pPr>
-              <w:pStyle w:val="Compact"/>
-              <w:jc w:val="center"/>
-            </w:pPr>
-            <w:r>
-              <w:t xml:space="preserve">$1,500</w:t>
-            </w:r>
-          </w:p>
-        </w:tc>
-        <w:tc>
-          <w:tcPr/>
-          <w:p>
-            <w:pPr>
-              <w:pStyle w:val="Compact"/>
-              <w:jc w:val="center"/>
-            </w:pPr>
-            <w:r>
-              <w:t xml:space="preserve">$26,000</w:t>
-            </w:r>
-          </w:p>
-        </w:tc>
-        <w:tc>
-          <w:tcPr/>
-          <w:p>
-            <w:pPr>
-              <w:pStyle w:val="Compact"/>
-              <w:jc w:val="center"/>
-            </w:pPr>
-            <w:r>
-              <w:t xml:space="preserve">$6,000</w:t>
+              <w:t xml:space="preserve">Electrical Installation Labor</w:t>
+            </w:r>
+          </w:p>
+        </w:tc>
+        <w:tc>
+          <w:tcPr/>
+          <w:p>
+            <w:pPr>
+              <w:pStyle w:val="Compact"/>
+              <w:jc w:val="center"/>
+            </w:pPr>
+            <w:r>
+              <w:t xml:space="preserve">₹1,25,000</w:t>
+            </w:r>
+          </w:p>
+        </w:tc>
+        <w:tc>
+          <w:tcPr/>
+          <w:p>
+            <w:pPr>
+              <w:pStyle w:val="Compact"/>
+              <w:jc w:val="center"/>
+            </w:pPr>
+            <w:r>
+              <w:t xml:space="preserve">₹22,00,000</w:t>
+            </w:r>
+          </w:p>
+        </w:tc>
+        <w:tc>
+          <w:tcPr/>
+          <w:p>
+            <w:pPr>
+              <w:pStyle w:val="Compact"/>
+              <w:jc w:val="center"/>
+            </w:pPr>
+            <w:r>
+              <w:t xml:space="preserve">₹5,00,000</w:t>
             </w:r>
           </w:p>
         </w:tc>
@@ -1733,42 +1692,42 @@
               <w:jc w:val="center"/>
             </w:pPr>
             <w:r>
-              <w:t xml:space="preserve">$0</w:t>
-            </w:r>
-          </w:p>
-        </w:tc>
-        <w:tc>
-          <w:tcPr/>
-          <w:p>
-            <w:pPr>
-              <w:pStyle w:val="Compact"/>
-              <w:jc w:val="center"/>
-            </w:pPr>
-            <w:r>
-              <w:t xml:space="preserve">$18,100</w:t>
-            </w:r>
-          </w:p>
-        </w:tc>
-        <w:tc>
-          <w:tcPr/>
-          <w:p>
-            <w:pPr>
-              <w:pStyle w:val="Compact"/>
-              <w:jc w:val="center"/>
-            </w:pPr>
-            <w:r>
-              <w:t xml:space="preserve">$9,000</w:t>
-            </w:r>
-          </w:p>
-        </w:tc>
-        <w:tc>
-          <w:tcPr/>
-          <w:p>
-            <w:pPr>
-              <w:pStyle w:val="Compact"/>
-            </w:pPr>
-            <w:r>
-              <w:t xml:space="preserve">Pre-compiled ONNX edge runtime. Zero ongoing per-tag SCADA software licenses.</w:t>
+              <w:t xml:space="preserve">₹0</w:t>
+            </w:r>
+          </w:p>
+        </w:tc>
+        <w:tc>
+          <w:tcPr/>
+          <w:p>
+            <w:pPr>
+              <w:pStyle w:val="Compact"/>
+              <w:jc w:val="center"/>
+            </w:pPr>
+            <w:r>
+              <w:t xml:space="preserve">₹15,00,000</w:t>
+            </w:r>
+          </w:p>
+        </w:tc>
+        <w:tc>
+          <w:tcPr/>
+          <w:p>
+            <w:pPr>
+              <w:pStyle w:val="Compact"/>
+              <w:jc w:val="center"/>
+            </w:pPr>
+            <w:r>
+              <w:t xml:space="preserve">₹7,50,000</w:t>
+            </w:r>
+          </w:p>
+        </w:tc>
+        <w:tc>
+          <w:tcPr/>
+          <w:p>
+            <w:pPr>
+              <w:pStyle w:val="Compact"/>
+            </w:pPr>
+            <w:r>
+              <w:t xml:space="preserve">Pre-compiled ONNX edge runtime. Zero recurring SCADA tag runtime fees.</w:t>
             </w:r>
           </w:p>
         </w:tc>
@@ -1801,54 +1760,54 @@
                 <w:b/>
                 <w:bCs/>
               </w:rPr>
-              <w:t xml:space="preserve">$5,400</w:t>
-            </w:r>
-          </w:p>
-        </w:tc>
-        <w:tc>
-          <w:tcPr/>
-          <w:p>
-            <w:pPr>
-              <w:pStyle w:val="Compact"/>
-              <w:jc w:val="center"/>
-            </w:pPr>
-            <w:r>
-              <w:rPr>
-                <w:b/>
-                <w:bCs/>
-              </w:rPr>
-              <w:t xml:space="preserve">$215,000</w:t>
-            </w:r>
-          </w:p>
-        </w:tc>
-        <w:tc>
-          <w:tcPr/>
-          <w:p>
-            <w:pPr>
-              <w:pStyle w:val="Compact"/>
-              <w:jc w:val="center"/>
-            </w:pPr>
-            <w:r>
-              <w:rPr>
-                <w:b/>
-                <w:bCs/>
-              </w:rPr>
-              <w:t xml:space="preserve">$43,200</w:t>
-            </w:r>
-          </w:p>
-        </w:tc>
-        <w:tc>
-          <w:tcPr/>
-          <w:p>
-            <w:pPr>
-              <w:pStyle w:val="Compact"/>
-            </w:pPr>
-            <w:r>
-              <w:rPr>
-                <w:b/>
-                <w:bCs/>
-              </w:rPr>
-              <w:t xml:space="preserve">$171,800 Direct Capital Savings</w:t>
+              <w:t xml:space="preserve">₹4,50,000</w:t>
+            </w:r>
+          </w:p>
+        </w:tc>
+        <w:tc>
+          <w:tcPr/>
+          <w:p>
+            <w:pPr>
+              <w:pStyle w:val="Compact"/>
+              <w:jc w:val="center"/>
+            </w:pPr>
+            <w:r>
+              <w:rPr>
+                <w:b/>
+                <w:bCs/>
+              </w:rPr>
+              <w:t xml:space="preserve">₹1,80,00,000</w:t>
+            </w:r>
+          </w:p>
+        </w:tc>
+        <w:tc>
+          <w:tcPr/>
+          <w:p>
+            <w:pPr>
+              <w:pStyle w:val="Compact"/>
+              <w:jc w:val="center"/>
+            </w:pPr>
+            <w:r>
+              <w:rPr>
+                <w:b/>
+                <w:bCs/>
+              </w:rPr>
+              <w:t xml:space="preserve">₹36,00,000</w:t>
+            </w:r>
+          </w:p>
+        </w:tc>
+        <w:tc>
+          <w:tcPr/>
+          <w:p>
+            <w:pPr>
+              <w:pStyle w:val="Compact"/>
+            </w:pPr>
+            <w:r>
+              <w:rPr>
+                <w:b/>
+                <w:bCs/>
+              </w:rPr>
+              <w:t xml:space="preserve">₹1.44 Crores Direct Capital Reduction (-80.0%)</w:t>
             </w:r>
           </w:p>
         </w:tc>
@@ -1876,7 +1835,7 @@
         <w:pStyle w:val="FirstParagraph"/>
       </w:pPr>
       <w:r>
-        <w:t xml:space="preserve">Cost alone is meaningless if the safety system fails during a catastrophe. The table below details system survivability during real-world blast and fire events:</w:t>
+        <w:t xml:space="preserve">Cost alone is meaningless if the safety system fails during an industrial emergency. The table below details system survivability during real-world blast and fire events:</w:t>
       </w:r>
     </w:p>
     <w:tbl>
@@ -1916,7 +1875,7 @@
               <w:jc w:val="center"/>
             </w:pPr>
             <w:r>
-              <w:t xml:space="preserve">Option A: Static NFPA</w:t>
+              <w:t xml:space="preserve">Option A: Static Signs</w:t>
             </w:r>
           </w:p>
         </w:tc>
@@ -2103,7 +2062,7 @@
               <w:pStyle w:val="Compact"/>
             </w:pPr>
             <w:r>
-              <w:t xml:space="preserve">Critical for ATEX Zone 1 petrochemical plants</w:t>
+              <w:t xml:space="preserve">Critical for hazardous Zone 1/2 process units</w:t>
             </w:r>
           </w:p>
         </w:tc>
@@ -2307,7 +2266,7 @@
               <w:pStyle w:val="Compact"/>
             </w:pPr>
             <w:r>
-              <w:t xml:space="preserve">Continuous guidance through total blackout</w:t>
+              <w:t xml:space="preserve">Continuous guidance through total plant blackout</w:t>
             </w:r>
           </w:p>
         </w:tc>
@@ -2348,23 +2307,23 @@
               <w:jc w:val="center"/>
             </w:pPr>
             <w:r>
-              <w:t xml:space="preserve">High cost ($3,500+ per added node run)</w:t>
-            </w:r>
-          </w:p>
-        </w:tc>
-        <w:tc>
-          <w:tcPr/>
-          <w:p>
-            <w:pPr>
-              <w:pStyle w:val="Compact"/>
-              <w:jc w:val="center"/>
-            </w:pPr>
-            <w:r>
-              <w:rPr>
-                <w:b/>
-                <w:bCs/>
-              </w:rPr>
-              <w:t xml:space="preserve">Plug-and-Play ($550/node self-pairing)</w:t>
+              <w:t xml:space="preserve">High cost (₹3,00,000+ per added node run)</w:t>
+            </w:r>
+          </w:p>
+        </w:tc>
+        <w:tc>
+          <w:tcPr/>
+          <w:p>
+            <w:pPr>
+              <w:pStyle w:val="Compact"/>
+              <w:jc w:val="center"/>
+            </w:pPr>
+            <w:r>
+              <w:rPr>
+                <w:b/>
+                <w:bCs/>
+              </w:rPr>
+              <w:t xml:space="preserve">Plug-and-Play (₹45,000/node self-pairing)</w:t>
             </w:r>
           </w:p>
         </w:tc>
@@ -2406,13 +2365,13 @@
         <w:t xml:space="preserve">Industry managers must justify safety investments through concrete operational ROI. Implementing ST-TBA-GAT delivers quantifiable returns across three operational pillars:</w:t>
       </w:r>
     </w:p>
-    <w:bookmarkStart w:id="14" w:name="X304aa08afd0eb8eafd1d96102f9a19dc018c84c"/>
+    <w:bookmarkStart w:id="14" w:name="X87baf99aa170b701f35ef12dbbf9f4680cdd4f7"/>
     <w:p>
       <w:pPr>
         <w:pStyle w:val="Heading3"/>
       </w:pPr>
       <w:r>
-        <w:t xml:space="preserve">A. Industrial Insurance Premium Reductions</w:t>
+        <w:t xml:space="preserve">A. Industrial Fire &amp; Property Insurance Premium Rebates</w:t>
       </w:r>
     </w:p>
     <w:p>
@@ -2424,7 +2383,23 @@
         </w:numPr>
       </w:pPr>
       <w:r>
-        <w:t xml:space="preserve">Industrial property and casualty underwriters (e.g. FM Global, Munich Re) assess risk based on structural fire resistance and life-safety evacuation automation.</w:t>
+        <w:t xml:space="preserve">Underwriters (e.g. New India Assurance, ICICI Lombard, Tata AIG, GIC Re, FM Global) assess plant risk based on fire safety automation and egress reliability under</w:t>
+      </w:r>
+      <w:r>
+        <w:t xml:space="preserve"> </w:t>
+      </w:r>
+      <w:r>
+        <w:rPr>
+          <w:b/>
+          <w:bCs/>
+        </w:rPr>
+        <w:t xml:space="preserve">TAC (Tariff Advisory Committee)</w:t>
+      </w:r>
+      <w:r>
+        <w:t xml:space="preserve"> </w:t>
+      </w:r>
+      <w:r>
+        <w:t xml:space="preserve">guidelines.</w:t>
       </w:r>
     </w:p>
     <w:p>
@@ -2452,7 +2427,7 @@
         <w:t xml:space="preserve"> </w:t>
       </w:r>
       <w:r>
-        <w:t xml:space="preserve">on commercial casualty and business interruption premiums.</w:t>
+        <w:t xml:space="preserve">on commercial fire, property, and business interruption insurance premiums.</w:t>
       </w:r>
     </w:p>
     <w:p>
@@ -2481,20 +2456,20 @@
           <w:b/>
           <w:bCs/>
         </w:rPr>
-        <w:t xml:space="preserve">$14,000 – $22,000 / year</w:t>
+        <w:t xml:space="preserve">₹12,00,000 – ₹18,00,000 / year</w:t>
       </w:r>
       <w:r>
         <w:t xml:space="preserve">.</w:t>
       </w:r>
     </w:p>
     <w:bookmarkEnd w:id="14"/>
-    <w:bookmarkStart w:id="15" w:name="Xa173834b212dab6464466d883e308dcd8270150"/>
+    <w:bookmarkStart w:id="15" w:name="X96e0bce63a0494764c1f618191d982aa5d2682f"/>
     <w:p>
       <w:pPr>
         <w:pStyle w:val="Heading3"/>
       </w:pPr>
       <w:r>
-        <w:t xml:space="preserve">B. Prevention of Catastrophic OSHA / Regulatory Penalties</w:t>
+        <w:t xml:space="preserve">B. Prevention of Regulatory Fines &amp; Factory Act Liabilities</w:t>
       </w:r>
     </w:p>
     <w:p>
@@ -2506,7 +2481,55 @@
         </w:numPr>
       </w:pPr>
       <w:r>
-        <w:t xml:space="preserve">In the event of a chemical plant incident, OSHA / EPA / PESO investigations levy severe fines for inadequate egress or entrapment ($161,323 per willful violation under OSHA 2024 schedules).</w:t>
+        <w:t xml:space="preserve">Under the</w:t>
+      </w:r>
+      <w:r>
+        <w:t xml:space="preserve"> </w:t>
+      </w:r>
+      <w:r>
+        <w:rPr>
+          <w:b/>
+          <w:bCs/>
+        </w:rPr>
+        <w:t xml:space="preserve">Factories Act, 1948</w:t>
+      </w:r>
+      <w:r>
+        <w:t xml:space="preserve"> </w:t>
+      </w:r>
+      <w:r>
+        <w:t xml:space="preserve">and</w:t>
+      </w:r>
+      <w:r>
+        <w:t xml:space="preserve"> </w:t>
+      </w:r>
+      <w:r>
+        <w:rPr>
+          <w:b/>
+          <w:bCs/>
+        </w:rPr>
+        <w:t xml:space="preserve">Petroleum &amp; Explosives Safety Organization (PESO)</w:t>
+      </w:r>
+      <w:r>
+        <w:t xml:space="preserve"> </w:t>
+      </w:r>
+      <w:r>
+        <w:t xml:space="preserve">rules, toxic releases or fatalities result in severe statutory penalties, legal inquiries, and mandatory production stops costing</w:t>
+      </w:r>
+      <w:r>
+        <w:t xml:space="preserve"> </w:t>
+      </w:r>
+      <w:r>
+        <w:rPr>
+          <w:b/>
+          <w:bCs/>
+        </w:rPr>
+        <w:t xml:space="preserve">₹15,00,000 – ₹50,00,000+</w:t>
+      </w:r>
+      <w:r>
+        <w:t xml:space="preserve"> </w:t>
+      </w:r>
+      <w:r>
+        <w:t xml:space="preserve">per day in idle plant capacity.</w:t>
       </w:r>
     </w:p>
     <w:p>
@@ -2518,23 +2541,7 @@
         </w:numPr>
       </w:pPr>
       <w:r>
-        <w:t xml:space="preserve">A single avoided regulatory shutdown or inquiry saves</w:t>
-      </w:r>
-      <w:r>
-        <w:t xml:space="preserve"> </w:t>
-      </w:r>
-      <w:r>
-        <w:rPr>
-          <w:b/>
-          <w:bCs/>
-        </w:rPr>
-        <w:t xml:space="preserve">$150,000 – $500,000+</w:t>
-      </w:r>
-      <w:r>
-        <w:t xml:space="preserve"> </w:t>
-      </w:r>
-      <w:r>
-        <w:t xml:space="preserve">in compliance costs and legal liability.</w:t>
+        <w:t xml:space="preserve">Reliable evacuation directly safeguards facility operating licenses and corporate ESG standing.</w:t>
       </w:r>
     </w:p>
     <w:bookmarkEnd w:id="15"/>
@@ -2556,7 +2563,7 @@
         </w:numPr>
       </w:pPr>
       <w:r>
-        <w:t xml:space="preserve">Centralized SCADA installation requires 3–5 weeks of hazardous-area hot-work permits, scaffolding, and selective production shutdowns costing upwards of $40,000/day.</w:t>
+        <w:t xml:space="preserve">Centralized SCADA installation requires 3–5 weeks of hazardous-area hot-work permits, scaffolding, and selective production shutdowns costing upwards of ₹30,00,000/day.</w:t>
       </w:r>
     </w:p>
     <w:p>
@@ -2610,7 +2617,7 @@
         <w:t xml:space="preserve">Net Initial Investment</w:t>
       </w:r>
       <w:r>
-        <w:t xml:space="preserve">: $43,200</w:t>
+        <w:t xml:space="preserve">: ₹36,00,000 (Rs. 36 Lakhs)</w:t>
       </w:r>
     </w:p>
     <w:p>
@@ -2629,7 +2636,7 @@
         <w:t xml:space="preserve">Annual Operational Cost Savings vs SCADA</w:t>
       </w:r>
       <w:r>
-        <w:t xml:space="preserve">: $13,200 / year</w:t>
+        <w:t xml:space="preserve">: ₹10,90,000 / year</w:t>
       </w:r>
     </w:p>
     <w:p>
@@ -2648,7 +2655,7 @@
         <w:t xml:space="preserve">Annual Insurance Premium Rebates</w:t>
       </w:r>
       <w:r>
-        <w:t xml:space="preserve">: ~$18,000 / year</w:t>
+        <w:t xml:space="preserve">: ~₹15,00,000 / year</w:t>
       </w:r>
     </w:p>
     <w:p>
@@ -2677,7 +2684,7 @@
           <w:b/>
           <w:bCs/>
         </w:rPr>
-        <w:t xml:space="preserve">$31,200 / year</w:t>
+        <w:t xml:space="preserve">₹25,90,000 / year</w:t>
       </w:r>
     </w:p>
     <w:p>

</xml_diff>